<commit_message>
Major changes from autocred-v.3.0
</commit_message>
<xml_diff>
--- a/template.docx
+++ b/template.docx
@@ -5,8 +5,8 @@
     <w:tbl>
       <w:tblPr>
         <w:tblStyle w:val="TableGrid"/>
-        <w:tblpPr w:leftFromText="180" w:rightFromText="180" w:vertAnchor="text" w:horzAnchor="margin" w:tblpXSpec="center" w:tblpY="4298"/>
-        <w:tblW w:w="0" w:type="auto"/>
+        <w:tblpPr w:leftFromText="180" w:rightFromText="180" w:vertAnchor="text" w:horzAnchor="margin" w:tblpXSpec="center" w:tblpY="4329"/>
+        <w:tblW w:w="14567" w:type="dxa"/>
         <w:tblBorders>
           <w:top w:val="none" w:sz="0" w:space="0" w:color="auto"/>
           <w:left w:val="none" w:sz="0" w:space="0" w:color="auto"/>
@@ -18,18 +18,18 @@
         <w:tblLook w:val="04A0" w:firstRow="1" w:lastRow="0" w:firstColumn="1" w:lastColumn="0" w:noHBand="0" w:noVBand="1"/>
       </w:tblPr>
       <w:tblGrid>
-        <w:gridCol w:w="2802"/>
-        <w:gridCol w:w="5953"/>
+        <w:gridCol w:w="2235"/>
+        <w:gridCol w:w="8788"/>
         <w:gridCol w:w="1276"/>
-        <w:gridCol w:w="1984"/>
+        <w:gridCol w:w="2268"/>
       </w:tblGrid>
       <w:tr>
         <w:trPr>
-          <w:trHeight w:val="490"/>
+          <w:trHeight w:val="132"/>
         </w:trPr>
         <w:tc>
           <w:tcPr>
-            <w:tcW w:w="12015" w:type="dxa"/>
+            <w:tcW w:w="14567" w:type="dxa"/>
             <w:gridSpan w:val="4"/>
             <w:shd w:val="clear" w:color="auto" w:fill="auto"/>
           </w:tcPr>
@@ -37,16 +37,16 @@
             <w:pPr>
               <w:jc w:val="center"/>
               <w:rPr>
-                <w:rFonts w:ascii="Georgia" w:hAnsi="Georgia"/>
-                <w:sz w:val="43"/>
-                <w:szCs w:val="43"/>
+                <w:rFonts w:asciiTheme="minorHAnsi" w:hAnsiTheme="minorHAnsi" w:cstheme="minorHAnsi"/>
+                <w:sz w:val="56"/>
+                <w:szCs w:val="56"/>
               </w:rPr>
             </w:pPr>
             <w:r>
               <w:rPr>
-                <w:rFonts w:ascii="Georgia" w:hAnsi="Georgia"/>
-                <w:sz w:val="43"/>
-                <w:szCs w:val="43"/>
+                <w:rFonts w:asciiTheme="minorHAnsi" w:hAnsiTheme="minorHAnsi" w:cstheme="minorHAnsi"/>
+                <w:sz w:val="56"/>
+                <w:szCs w:val="56"/>
               </w:rPr>
               <w:t>{name}</w:t>
             </w:r>
@@ -59,31 +59,19 @@
         </w:trPr>
         <w:tc>
           <w:tcPr>
-            <w:tcW w:w="2802" w:type="dxa"/>
+            <w:tcW w:w="14567" w:type="dxa"/>
+            <w:gridSpan w:val="4"/>
             <w:shd w:val="clear" w:color="auto" w:fill="auto"/>
           </w:tcPr>
-          <w:p/>
-        </w:tc>
-        <w:tc>
-          <w:tcPr>
-            <w:tcW w:w="5953" w:type="dxa"/>
-            <w:shd w:val="clear" w:color="auto" w:fill="auto"/>
-          </w:tcPr>
-          <w:p/>
-        </w:tc>
-        <w:tc>
-          <w:tcPr>
-            <w:tcW w:w="1276" w:type="dxa"/>
-            <w:shd w:val="clear" w:color="auto" w:fill="auto"/>
-          </w:tcPr>
-          <w:p/>
-        </w:tc>
-        <w:tc>
-          <w:tcPr>
-            <w:tcW w:w="1984" w:type="dxa"/>
-            <w:shd w:val="clear" w:color="auto" w:fill="auto"/>
-          </w:tcPr>
-          <w:p/>
+          <w:p>
+            <w:pPr>
+              <w:rPr>
+                <w:rFonts w:asciiTheme="minorHAnsi" w:hAnsiTheme="minorHAnsi" w:cstheme="minorHAnsi"/>
+                <w:sz w:val="53"/>
+                <w:szCs w:val="53"/>
+              </w:rPr>
+            </w:pPr>
+          </w:p>
         </w:tc>
       </w:tr>
       <w:tr>
@@ -92,12 +80,13 @@
         </w:trPr>
         <w:tc>
           <w:tcPr>
-            <w:tcW w:w="2802" w:type="dxa"/>
+            <w:tcW w:w="2235" w:type="dxa"/>
             <w:shd w:val="clear" w:color="auto" w:fill="auto"/>
           </w:tcPr>
           <w:p>
             <w:pPr>
               <w:rPr>
+                <w:rFonts w:asciiTheme="minorHAnsi" w:hAnsiTheme="minorHAnsi" w:cstheme="minorHAnsi"/>
                 <w:sz w:val="43"/>
                 <w:szCs w:val="43"/>
               </w:rPr>
@@ -106,19 +95,21 @@
         </w:tc>
         <w:tc>
           <w:tcPr>
-            <w:tcW w:w="5953" w:type="dxa"/>
+            <w:tcW w:w="8788" w:type="dxa"/>
             <w:shd w:val="clear" w:color="auto" w:fill="auto"/>
           </w:tcPr>
           <w:p>
             <w:pPr>
               <w:jc w:val="center"/>
               <w:rPr>
+                <w:rFonts w:asciiTheme="minorHAnsi" w:hAnsiTheme="minorHAnsi" w:cstheme="minorHAnsi"/>
                 <w:sz w:val="43"/>
                 <w:szCs w:val="43"/>
               </w:rPr>
             </w:pPr>
             <w:r>
               <w:rPr>
+                <w:rFonts w:asciiTheme="minorHAnsi" w:hAnsiTheme="minorHAnsi" w:cstheme="minorHAnsi"/>
                 <w:sz w:val="43"/>
                 <w:szCs w:val="43"/>
               </w:rPr>
@@ -134,6 +125,7 @@
           <w:p>
             <w:pPr>
               <w:rPr>
+                <w:rFonts w:asciiTheme="minorHAnsi" w:hAnsiTheme="minorHAnsi" w:cstheme="minorHAnsi"/>
                 <w:sz w:val="43"/>
                 <w:szCs w:val="43"/>
               </w:rPr>
@@ -142,19 +134,21 @@
         </w:tc>
         <w:tc>
           <w:tcPr>
-            <w:tcW w:w="1984" w:type="dxa"/>
+            <w:tcW w:w="2268" w:type="dxa"/>
             <w:shd w:val="clear" w:color="auto" w:fill="auto"/>
           </w:tcPr>
           <w:p>
             <w:pPr>
               <w:jc w:val="center"/>
               <w:rPr>
+                <w:rFonts w:asciiTheme="minorHAnsi" w:hAnsiTheme="minorHAnsi" w:cstheme="minorHAnsi"/>
                 <w:sz w:val="43"/>
                 <w:szCs w:val="43"/>
               </w:rPr>
             </w:pPr>
             <w:r>
               <w:rPr>
+                <w:rFonts w:asciiTheme="minorHAnsi" w:hAnsiTheme="minorHAnsi" w:cstheme="minorHAnsi"/>
                 <w:sz w:val="43"/>
                 <w:szCs w:val="43"/>
               </w:rPr>
@@ -172,15 +166,15 @@
         <mc:AlternateContent>
           <mc:Choice Requires="wps">
             <w:drawing>
-              <wp:anchor distT="45720" distB="45720" distL="114300" distR="114300" simplePos="0" relativeHeight="251662336" behindDoc="0" locked="0" layoutInCell="1" allowOverlap="1" wp14:anchorId="33D7FA0E" wp14:editId="7FA0BB2E">
+              <wp:anchor distT="45720" distB="45720" distL="114300" distR="114300" simplePos="0" relativeHeight="251657216" behindDoc="0" locked="0" layoutInCell="1" allowOverlap="1" wp14:anchorId="33D7FA0E" wp14:editId="7FA0BB2E">
                 <wp:simplePos x="0" y="0"/>
                 <wp:positionH relativeFrom="column">
-                  <wp:posOffset>2863850</wp:posOffset>
+                  <wp:posOffset>1649730</wp:posOffset>
                 </wp:positionH>
                 <wp:positionV relativeFrom="page">
-                  <wp:posOffset>4519295</wp:posOffset>
+                  <wp:posOffset>4895215</wp:posOffset>
                 </wp:positionV>
-                <wp:extent cx="5001260" cy="518795"/>
+                <wp:extent cx="5076825" cy="422910"/>
                 <wp:effectExtent l="0" t="0" r="0" b="0"/>
                 <wp:wrapNone/>
                 <wp:docPr id="2060286925" name="Text Box 2"/>
@@ -196,7 +190,7 @@
                       <wps:spPr bwMode="auto">
                         <a:xfrm>
                           <a:off x="0" y="0"/>
-                          <a:ext cx="5001260" cy="518795"/>
+                          <a:ext cx="5076825" cy="422910"/>
                         </a:xfrm>
                         <a:prstGeom prst="rect">
                           <a:avLst/>
@@ -214,7 +208,7 @@
                           <w:p>
                             <w:pPr>
                               <w:pStyle w:val="Heading1"/>
-                              <w:spacing w:before="170"/>
+                              <w:spacing w:before="0"/>
                               <w:ind w:left="0"/>
                             </w:pPr>
                             <w:r>
@@ -222,55 +216,13 @@
                                 <w:color w:val="AB7C34"/>
                                 <w:spacing w:val="34"/>
                               </w:rPr>
-                              <w:t>Rapid</w:t>
-                            </w:r>
-                            <w:r>
-                              <w:rPr>
-                                <w:color w:val="AB7C34"/>
-                                <w:spacing w:val="74"/>
-                              </w:rPr>
-                              <w:t xml:space="preserve"> </w:t>
-                            </w:r>
-                            <w:r>
-                              <w:rPr>
-                                <w:color w:val="AB7C34"/>
-                                <w:spacing w:val="34"/>
-                              </w:rPr>
-                              <w:t>Round</w:t>
-                            </w:r>
-                            <w:r>
-                              <w:rPr>
-                                <w:color w:val="AB7C34"/>
-                                <w:spacing w:val="75"/>
-                              </w:rPr>
-                              <w:t xml:space="preserve"> </w:t>
-                            </w:r>
-                            <w:r>
-                              <w:rPr>
-                                <w:color w:val="AB7C34"/>
-                                <w:spacing w:val="39"/>
-                              </w:rPr>
-                              <w:t>Programming</w:t>
-                            </w:r>
-                            <w:r>
-                              <w:rPr>
-                                <w:color w:val="AB7C34"/>
-                                <w:spacing w:val="74"/>
-                              </w:rPr>
-                              <w:t xml:space="preserve"> </w:t>
-                            </w:r>
-                            <w:r>
-                              <w:rPr>
-                                <w:color w:val="AB7C34"/>
-                                <w:spacing w:val="28"/>
-                              </w:rPr>
-                              <w:t>Quiz</w:t>
+                              <w:t>Game Development Workshop 2.0</w:t>
                             </w:r>
                           </w:p>
                         </w:txbxContent>
                       </wps:txbx>
                       <wps:bodyPr rot="0" vert="horz" wrap="square" lIns="91440" tIns="45720" rIns="91440" bIns="45720" anchor="t" anchorCtr="0">
-                        <a:spAutoFit/>
+                        <a:noAutofit/>
                       </wps:bodyPr>
                     </wps:wsp>
                   </a:graphicData>
@@ -279,7 +231,7 @@
                   <wp14:pctWidth>0</wp14:pctWidth>
                 </wp14:sizeRelH>
                 <wp14:sizeRelV relativeFrom="margin">
-                  <wp14:pctHeight>20000</wp14:pctHeight>
+                  <wp14:pctHeight>0</wp14:pctHeight>
                 </wp14:sizeRelV>
               </wp:anchor>
             </w:drawing>
@@ -290,13 +242,13 @@
                 <v:stroke joinstyle="miter"/>
                 <v:path gradientshapeok="t" o:connecttype="rect"/>
               </v:shapetype>
-              <v:shape id="Text Box 2" o:spid="_x0000_s1026" type="#_x0000_t202" style="position:absolute;margin-left:225.5pt;margin-top:355.85pt;width:393.8pt;height:40.85pt;z-index:251662336;visibility:visible;mso-wrap-style:square;mso-width-percent:0;mso-height-percent:200;mso-wrap-distance-left:9pt;mso-wrap-distance-top:3.6pt;mso-wrap-distance-right:9pt;mso-wrap-distance-bottom:3.6pt;mso-position-horizontal:absolute;mso-position-horizontal-relative:text;mso-position-vertical:absolute;mso-position-vertical-relative:page;mso-width-percent:0;mso-height-percent:200;mso-width-relative:margin;mso-height-relative:margin;v-text-anchor:top" o:gfxdata="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" filled="f" stroked="f">
-                <v:textbox style="mso-fit-shape-to-text:t">
+              <v:shape id="Text Box 2" o:spid="_x0000_s1026" type="#_x0000_t202" style="position:absolute;margin-left:129.9pt;margin-top:385.45pt;width:399.75pt;height:33.3pt;z-index:251657216;visibility:visible;mso-wrap-style:square;mso-width-percent:0;mso-height-percent:0;mso-wrap-distance-left:9pt;mso-wrap-distance-top:3.6pt;mso-wrap-distance-right:9pt;mso-wrap-distance-bottom:3.6pt;mso-position-horizontal:absolute;mso-position-horizontal-relative:text;mso-position-vertical:absolute;mso-position-vertical-relative:page;mso-width-percent:0;mso-height-percent:0;mso-width-relative:margin;mso-height-relative:margin;v-text-anchor:top" o:gfxdata="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" filled="f" stroked="f">
+                <v:textbox>
                   <w:txbxContent>
                     <w:p>
                       <w:pPr>
                         <w:pStyle w:val="Heading1"/>
-                        <w:spacing w:before="170"/>
+                        <w:spacing w:before="0"/>
                         <w:ind w:left="0"/>
                       </w:pPr>
                       <w:r>
@@ -304,49 +256,7 @@
                           <w:color w:val="AB7C34"/>
                           <w:spacing w:val="34"/>
                         </w:rPr>
-                        <w:t>Rapid</w:t>
-                      </w:r>
-                      <w:r>
-                        <w:rPr>
-                          <w:color w:val="AB7C34"/>
-                          <w:spacing w:val="74"/>
-                        </w:rPr>
-                        <w:t xml:space="preserve"> </w:t>
-                      </w:r>
-                      <w:r>
-                        <w:rPr>
-                          <w:color w:val="AB7C34"/>
-                          <w:spacing w:val="34"/>
-                        </w:rPr>
-                        <w:t>Round</w:t>
-                      </w:r>
-                      <w:r>
-                        <w:rPr>
-                          <w:color w:val="AB7C34"/>
-                          <w:spacing w:val="75"/>
-                        </w:rPr>
-                        <w:t xml:space="preserve"> </w:t>
-                      </w:r>
-                      <w:r>
-                        <w:rPr>
-                          <w:color w:val="AB7C34"/>
-                          <w:spacing w:val="39"/>
-                        </w:rPr>
-                        <w:t>Programming</w:t>
-                      </w:r>
-                      <w:r>
-                        <w:rPr>
-                          <w:color w:val="AB7C34"/>
-                          <w:spacing w:val="74"/>
-                        </w:rPr>
-                        <w:t xml:space="preserve"> </w:t>
-                      </w:r>
-                      <w:r>
-                        <w:rPr>
-                          <w:color w:val="AB7C34"/>
-                          <w:spacing w:val="28"/>
-                        </w:rPr>
-                        <w:t>Quiz</w:t>
+                        <w:t>Game Development Workshop 2.0</w:t>
                       </w:r>
                     </w:p>
                   </w:txbxContent>
@@ -361,19 +271,142 @@
         <w:rPr>
           <w:noProof/>
         </w:rPr>
+        <mc:AlternateContent>
+          <mc:Choice Requires="wps">
+            <w:drawing>
+              <wp:anchor distT="45720" distB="45720" distL="114300" distR="114300" simplePos="0" relativeHeight="251664384" behindDoc="0" locked="0" layoutInCell="1" allowOverlap="1" wp14:anchorId="6F27DF50" wp14:editId="67AEF0E7">
+                <wp:simplePos x="0" y="0"/>
+                <wp:positionH relativeFrom="column">
+                  <wp:posOffset>7046595</wp:posOffset>
+                </wp:positionH>
+                <wp:positionV relativeFrom="page">
+                  <wp:posOffset>4878705</wp:posOffset>
+                </wp:positionV>
+                <wp:extent cx="1647825" cy="403860"/>
+                <wp:effectExtent l="0" t="0" r="0" b="0"/>
+                <wp:wrapNone/>
+                <wp:docPr id="652818818" name="Text Box 2"/>
+                <wp:cNvGraphicFramePr>
+                  <a:graphicFrameLocks xmlns:a="http://schemas.openxmlformats.org/drawingml/2006/main"/>
+                </wp:cNvGraphicFramePr>
+                <a:graphic xmlns:a="http://schemas.openxmlformats.org/drawingml/2006/main">
+                  <a:graphicData uri="http://schemas.microsoft.com/office/word/2010/wordprocessingShape">
+                    <wps:wsp>
+                      <wps:cNvSpPr txBox="1">
+                        <a:spLocks noChangeArrowheads="1"/>
+                      </wps:cNvSpPr>
+                      <wps:spPr bwMode="auto">
+                        <a:xfrm>
+                          <a:off x="0" y="0"/>
+                          <a:ext cx="1647825" cy="403860"/>
+                        </a:xfrm>
+                        <a:prstGeom prst="rect">
+                          <a:avLst/>
+                        </a:prstGeom>
+                        <a:noFill/>
+                        <a:ln w="9525">
+                          <a:noFill/>
+                          <a:miter lim="800000"/>
+                          <a:headEnd/>
+                          <a:tailEnd/>
+                        </a:ln>
+                      </wps:spPr>
+                      <wps:txbx>
+                        <w:txbxContent>
+                          <w:p>
+                            <w:pPr>
+                              <w:pStyle w:val="Heading1"/>
+                              <w:spacing w:before="0"/>
+                              <w:ind w:left="0"/>
+                              <w:rPr>
+                                <w:rFonts w:ascii="Palatino Linotype" w:hAnsi="Palatino Linotype" w:cs="Times New Roman"/>
+                                <w:b/>
+                                <w:bCs/>
+                              </w:rPr>
+                            </w:pPr>
+                            <w:r>
+                              <w:rPr>
+                                <w:rFonts w:ascii="Palatino Linotype" w:hAnsi="Palatino Linotype" w:cs="Times New Roman"/>
+                                <w:b/>
+                                <w:bCs/>
+                                <w:color w:val="AB7C34"/>
+                                <w:spacing w:val="34"/>
+                              </w:rPr>
+                              <w:t>28.10.2024</w:t>
+                            </w:r>
+                          </w:p>
+                        </w:txbxContent>
+                      </wps:txbx>
+                      <wps:bodyPr rot="0" vert="horz" wrap="square" lIns="91440" tIns="45720" rIns="91440" bIns="45720" anchor="t" anchorCtr="0">
+                        <a:noAutofit/>
+                      </wps:bodyPr>
+                    </wps:wsp>
+                  </a:graphicData>
+                </a:graphic>
+                <wp14:sizeRelH relativeFrom="margin">
+                  <wp14:pctWidth>0</wp14:pctWidth>
+                </wp14:sizeRelH>
+                <wp14:sizeRelV relativeFrom="margin">
+                  <wp14:pctHeight>0</wp14:pctHeight>
+                </wp14:sizeRelV>
+              </wp:anchor>
+            </w:drawing>
+          </mc:Choice>
+          <mc:Fallback>
+            <w:pict>
+              <v:shape w14:anchorId="6F27DF50" id="_x0000_s1027" type="#_x0000_t202" style="position:absolute;margin-left:554.85pt;margin-top:384.15pt;width:129.75pt;height:31.8pt;z-index:251664384;visibility:visible;mso-wrap-style:square;mso-width-percent:0;mso-height-percent:0;mso-wrap-distance-left:9pt;mso-wrap-distance-top:3.6pt;mso-wrap-distance-right:9pt;mso-wrap-distance-bottom:3.6pt;mso-position-horizontal:absolute;mso-position-horizontal-relative:text;mso-position-vertical:absolute;mso-position-vertical-relative:page;mso-width-percent:0;mso-height-percent:0;mso-width-relative:margin;mso-height-relative:margin;v-text-anchor:top" o:gfxdata="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" filled="f" stroked="f">
+                <v:textbox>
+                  <w:txbxContent>
+                    <w:p>
+                      <w:pPr>
+                        <w:pStyle w:val="Heading1"/>
+                        <w:spacing w:before="0"/>
+                        <w:ind w:left="0"/>
+                        <w:rPr>
+                          <w:rFonts w:ascii="Palatino Linotype" w:hAnsi="Palatino Linotype" w:cs="Times New Roman"/>
+                          <w:b/>
+                          <w:bCs/>
+                        </w:rPr>
+                      </w:pPr>
+                      <w:r>
+                        <w:rPr>
+                          <w:rFonts w:ascii="Palatino Linotype" w:hAnsi="Palatino Linotype" w:cs="Times New Roman"/>
+                          <w:b/>
+                          <w:bCs/>
+                          <w:color w:val="AB7C34"/>
+                          <w:spacing w:val="34"/>
+                        </w:rPr>
+                        <w:t>28.10.2024</w:t>
+                      </w:r>
+                    </w:p>
+                  </w:txbxContent>
+                </v:textbox>
+                <w10:wrap anchory="page"/>
+              </v:shape>
+            </w:pict>
+          </mc:Fallback>
+        </mc:AlternateContent>
+      </w:r>
+      <w:r>
+        <w:rPr>
+          <w:rFonts w:ascii="Georgia" w:hAnsi="Georgia"/>
+          <w:noProof/>
+          <w:sz w:val="43"/>
+          <w:szCs w:val="43"/>
+        </w:rPr>
         <w:drawing>
-          <wp:anchor distT="0" distB="0" distL="114300" distR="114300" simplePos="0" relativeHeight="251657216" behindDoc="1" locked="0" layoutInCell="1" allowOverlap="1">
+          <wp:anchor distT="0" distB="0" distL="114300" distR="114300" simplePos="0" relativeHeight="251661824" behindDoc="1" locked="0" layoutInCell="1" allowOverlap="1">
             <wp:simplePos x="0" y="0"/>
             <wp:positionH relativeFrom="column">
-              <wp:posOffset>-1229360</wp:posOffset>
+              <wp:posOffset>-1257300</wp:posOffset>
             </wp:positionH>
             <wp:positionV relativeFrom="paragraph">
-              <wp:posOffset>-606103</wp:posOffset>
+              <wp:posOffset>-621030</wp:posOffset>
             </wp:positionV>
-            <wp:extent cx="10675088" cy="7548932"/>
-            <wp:effectExtent l="0" t="0" r="0" b="0"/>
+            <wp:extent cx="10668000" cy="7541904"/>
+            <wp:effectExtent l="0" t="0" r="0" b="1905"/>
             <wp:wrapNone/>
-            <wp:docPr id="2119760734" name="Picture 1"/>
+            <wp:docPr id="857925710" name="Picture 2"/>
             <wp:cNvGraphicFramePr>
               <a:graphicFrameLocks xmlns:a="http://schemas.openxmlformats.org/drawingml/2006/main" noChangeAspect="1"/>
             </wp:cNvGraphicFramePr>
@@ -381,7 +414,7 @@
               <a:graphicData uri="http://schemas.openxmlformats.org/drawingml/2006/picture">
                 <pic:pic xmlns:pic="http://schemas.openxmlformats.org/drawingml/2006/picture">
                   <pic:nvPicPr>
-                    <pic:cNvPr id="2119760734" name="Picture 2119760734"/>
+                    <pic:cNvPr id="857925710" name="Picture 857925710"/>
                     <pic:cNvPicPr/>
                   </pic:nvPicPr>
                   <pic:blipFill>
@@ -399,7 +432,7 @@
                   <pic:spPr>
                     <a:xfrm>
                       <a:off x="0" y="0"/>
-                      <a:ext cx="10675088" cy="7548932"/>
+                      <a:ext cx="10668000" cy="7541904"/>
                     </a:xfrm>
                     <a:prstGeom prst="rect">
                       <a:avLst/>

</xml_diff>